<commit_message>
refactor: update gesture command mapping by removing 'Like' and using 'Call' for upward movement; enhance cooldown and PID parameters in flight control REPORD DOCX
</commit_message>
<xml_diff>
--- a/report_tello.docx
+++ b/report_tello.docx
@@ -79,19 +79,7 @@
           <w:szCs w:val="44"/>
           <w:rtl/>
         </w:rPr>
-        <w:t>זיהוי ופעולה אוטונומית באמצעות בינה מלאכותית</w:t>
-      </w:r>
-      <w:r>
-        <w:rPr>
-          <w:rFonts w:ascii="David" w:hAnsi="David" w:cs="David"/>
-          <w:b/>
-          <w:bCs/>
-          <w:color w:val="2E74B5"/>
-          <w:sz w:val="44"/>
-          <w:szCs w:val="44"/>
-          <w:rtl/>
-        </w:rPr>
-        <w:t xml:space="preserve"> (מחוות יד ופקודות קוליות)</w:t>
+        <w:t>זיהוי ופעולה אוטונומית באמצעות בינה מלאכותית (מחוות יד ופקודות קוליות)</w:t>
       </w:r>
     </w:p>
     <w:tbl>
@@ -723,6 +711,12 @@
     <w:sdt>
       <w:sdtPr>
         <w:rPr>
+          <w:rFonts w:ascii="Arial" w:eastAsiaTheme="minorEastAsia" w:hAnsi="Arial" w:cstheme="minorBidi"/>
+          <w:b w:val="0"/>
+          <w:bCs w:val="0"/>
+          <w:color w:val="auto"/>
+          <w:sz w:val="20"/>
+          <w:szCs w:val="22"/>
           <w:rtl/>
         </w:rPr>
         <w:id w:val="1542401730"/>
@@ -733,11 +727,7 @@
       </w:sdtPr>
       <w:sdtEndPr>
         <w:rPr>
-          <w:rFonts w:ascii="Arial" w:eastAsiaTheme="minorEastAsia" w:hAnsi="Arial" w:cstheme="minorBidi"/>
           <w:noProof/>
-          <w:color w:val="auto"/>
-          <w:sz w:val="20"/>
-          <w:szCs w:val="22"/>
         </w:rPr>
       </w:sdtEndPr>
       <w:sdtContent>
@@ -4873,7 +4863,51 @@
           <w:szCs w:val="28"/>
           <w:rtl/>
         </w:rPr>
-        <w:t>, ולכן נדרש שיפור ההתאמה.</w:t>
+        <w:t xml:space="preserve">, ולכן המחווה </w:t>
+      </w:r>
+      <w:proofErr w:type="spellStart"/>
+      <w:r>
+        <w:rPr>
+          <w:rFonts w:ascii="David" w:hAnsi="David" w:cs="David"/>
+          <w:color w:val="111111"/>
+          <w:sz w:val="28"/>
+          <w:szCs w:val="28"/>
+          <w:rtl/>
+        </w:rPr>
+        <w:t>Like</w:t>
+      </w:r>
+      <w:proofErr w:type="spellEnd"/>
+      <w:r>
+        <w:rPr>
+          <w:rFonts w:ascii="David" w:hAnsi="David" w:cs="David"/>
+          <w:color w:val="111111"/>
+          <w:sz w:val="28"/>
+          <w:szCs w:val="28"/>
+          <w:rtl/>
+        </w:rPr>
+        <w:t xml:space="preserve"> הוסרה מהמיפוי ו-</w:t>
+      </w:r>
+      <w:proofErr w:type="spellStart"/>
+      <w:r>
+        <w:rPr>
+          <w:rFonts w:ascii="David" w:hAnsi="David" w:cs="David"/>
+          <w:color w:val="111111"/>
+          <w:sz w:val="28"/>
+          <w:szCs w:val="28"/>
+          <w:rtl/>
+        </w:rPr>
+        <w:t>Call</w:t>
+      </w:r>
+      <w:proofErr w:type="spellEnd"/>
+      <w:r>
+        <w:rPr>
+          <w:rFonts w:ascii="David" w:hAnsi="David" w:cs="David"/>
+          <w:color w:val="111111"/>
+          <w:sz w:val="28"/>
+          <w:szCs w:val="28"/>
+          <w:rtl/>
+        </w:rPr>
+        <w:t xml:space="preserve"> משמשת כעת לתנועה למעלה.</w:t>
       </w:r>
     </w:p>
     <w:p>
@@ -5242,13 +5276,51 @@
       </w:r>
       <w:r>
         <w:rPr>
-          <w:rFonts w:ascii="David" w:hAnsi="David" w:cs="David"/>
-          <w:color w:val="111111"/>
-          <w:sz w:val="28"/>
-          <w:szCs w:val="28"/>
-          <w:rtl/>
-        </w:rPr>
-        <w:t>.</w:t>
+          <w:rFonts w:ascii="David" w:hAnsi="David" w:cs="David" w:hint="cs"/>
+          <w:color w:val="111111"/>
+          <w:sz w:val="28"/>
+          <w:szCs w:val="28"/>
+          <w:rtl/>
+        </w:rPr>
+        <w:t>(</w:t>
+      </w:r>
+      <w:r>
+        <w:rPr>
+          <w:rFonts w:ascii="David" w:hAnsi="David" w:cs="David"/>
+          <w:color w:val="111111"/>
+          <w:sz w:val="28"/>
+          <w:szCs w:val="28"/>
+        </w:rPr>
+        <w:t>EMA</w:t>
+      </w:r>
+      <w:r>
+        <w:rPr>
+          <w:rFonts w:ascii="David" w:hAnsi="David" w:cs="David" w:hint="cs"/>
+          <w:color w:val="111111"/>
+          <w:sz w:val="28"/>
+          <w:szCs w:val="28"/>
+          <w:rtl/>
+        </w:rPr>
+        <w:t>-</w:t>
+      </w:r>
+      <w:r>
+        <w:rPr>
+          <w:rFonts w:ascii="David" w:hAnsi="David" w:cs="David"/>
+          <w:color w:val="111111"/>
+          <w:sz w:val="28"/>
+          <w:szCs w:val="28"/>
+        </w:rPr>
+        <w:t xml:space="preserve"> </w:t>
+      </w:r>
+      <w:r>
+        <w:rPr>
+          <w:rFonts w:ascii="David" w:hAnsi="David" w:cs="David" w:hint="cs"/>
+          <w:color w:val="111111"/>
+          <w:sz w:val="28"/>
+          <w:szCs w:val="28"/>
+          <w:rtl/>
+        </w:rPr>
+        <w:t xml:space="preserve">טכניקה למעקב אחר מידע כאשר נותנים יותר משקל למידע הקודם ובכך הממוצע מסתגל מהר למידע החדש עם סינון של מידע שהוא רעש לטווח הקצר). </w:t>
       </w:r>
     </w:p>
     <w:p>
@@ -6299,118 +6371,62 @@
           <w:szCs w:val="28"/>
           <w:rtl/>
         </w:rPr>
+        <w:t xml:space="preserve">במעקב, שגיאת המיקום האופקי מפעילה PID </w:t>
+      </w:r>
+      <w:proofErr w:type="spellStart"/>
+      <w:r>
+        <w:rPr>
+          <w:rFonts w:ascii="David" w:hAnsi="David" w:cs="David"/>
+          <w:color w:val="111111"/>
+          <w:sz w:val="28"/>
+          <w:szCs w:val="28"/>
+          <w:rtl/>
+        </w:rPr>
+        <w:t>לסבסוב</w:t>
+      </w:r>
+      <w:proofErr w:type="spellEnd"/>
+      <w:r>
+        <w:rPr>
+          <w:rFonts w:ascii="David" w:hAnsi="David" w:cs="David"/>
+          <w:color w:val="111111"/>
+          <w:sz w:val="28"/>
+          <w:szCs w:val="28"/>
+          <w:rtl/>
+        </w:rPr>
+        <w:t xml:space="preserve">, שגיאת המיקום האנכי מפעילה PID לגובה, ויחס גובה הפנים לפריים מפעיל PID למרחק. יחס גובה הפנים הרצוי הוא 0.22. הפלט מוגבל לטווח [-100, 100] ונשלח כפקודות RC לכל היותר פעם ב-50ms. ערכי הבקרים הנוכחיים הם: </w:t>
+      </w:r>
+      <w:proofErr w:type="spellStart"/>
+      <w:r>
+        <w:rPr>
+          <w:rFonts w:ascii="David" w:hAnsi="David" w:cs="David"/>
+          <w:color w:val="111111"/>
+          <w:sz w:val="28"/>
+          <w:szCs w:val="28"/>
+          <w:rtl/>
+        </w:rPr>
+        <w:t>לסבסוב</w:t>
+      </w:r>
+      <w:proofErr w:type="spellEnd"/>
+      <w:r>
+        <w:rPr>
+          <w:rFonts w:ascii="David" w:hAnsi="David" w:cs="David"/>
+          <w:color w:val="111111"/>
+          <w:sz w:val="28"/>
+          <w:szCs w:val="28"/>
+          <w:rtl/>
+        </w:rPr>
         <w:t xml:space="preserve"> </w:t>
       </w:r>
-      <w:r>
-        <w:rPr>
-          <w:rFonts w:ascii="David" w:hAnsi="David" w:cs="David" w:hint="cs"/>
-          <w:color w:val="111111"/>
-          <w:sz w:val="28"/>
-          <w:szCs w:val="28"/>
-          <w:rtl/>
-        </w:rPr>
-        <w:t>במעקב</w:t>
-      </w:r>
-      <w:r>
-        <w:rPr>
-          <w:rFonts w:ascii="David" w:hAnsi="David" w:cs="David"/>
-          <w:color w:val="111111"/>
-          <w:sz w:val="28"/>
-          <w:szCs w:val="28"/>
-          <w:rtl/>
-        </w:rPr>
-        <w:t xml:space="preserve">, </w:t>
-      </w:r>
-      <w:r>
-        <w:rPr>
-          <w:rFonts w:ascii="David" w:hAnsi="David" w:cs="David" w:hint="cs"/>
-          <w:color w:val="111111"/>
-          <w:sz w:val="28"/>
-          <w:szCs w:val="28"/>
-          <w:rtl/>
-        </w:rPr>
-        <w:t>שגיאת</w:t>
-      </w:r>
-      <w:r>
-        <w:rPr>
-          <w:rFonts w:ascii="David" w:hAnsi="David" w:cs="David"/>
-          <w:color w:val="111111"/>
-          <w:sz w:val="28"/>
-          <w:szCs w:val="28"/>
-          <w:rtl/>
-        </w:rPr>
-        <w:t xml:space="preserve"> </w:t>
-      </w:r>
-      <w:r>
-        <w:rPr>
-          <w:rFonts w:ascii="David" w:hAnsi="David" w:cs="David" w:hint="cs"/>
-          <w:color w:val="111111"/>
-          <w:sz w:val="28"/>
-          <w:szCs w:val="28"/>
-          <w:rtl/>
-        </w:rPr>
-        <w:t>המיקום</w:t>
-      </w:r>
-      <w:r>
-        <w:rPr>
-          <w:rFonts w:ascii="David" w:hAnsi="David" w:cs="David"/>
-          <w:color w:val="111111"/>
-          <w:sz w:val="28"/>
-          <w:szCs w:val="28"/>
-          <w:rtl/>
-        </w:rPr>
-        <w:t xml:space="preserve"> </w:t>
-      </w:r>
-      <w:r>
-        <w:rPr>
-          <w:rFonts w:ascii="David" w:hAnsi="David" w:cs="David" w:hint="cs"/>
-          <w:color w:val="111111"/>
-          <w:sz w:val="28"/>
-          <w:szCs w:val="28"/>
-          <w:rtl/>
-        </w:rPr>
-        <w:t>האופקי</w:t>
-      </w:r>
-      <w:r>
-        <w:rPr>
-          <w:rFonts w:ascii="David" w:hAnsi="David" w:cs="David"/>
-          <w:color w:val="111111"/>
-          <w:sz w:val="28"/>
-          <w:szCs w:val="28"/>
-          <w:rtl/>
-        </w:rPr>
-        <w:t xml:space="preserve"> </w:t>
-      </w:r>
-      <w:r>
-        <w:rPr>
-          <w:rFonts w:ascii="David" w:hAnsi="David" w:cs="David" w:hint="cs"/>
-          <w:color w:val="111111"/>
-          <w:sz w:val="28"/>
-          <w:szCs w:val="28"/>
-          <w:rtl/>
-        </w:rPr>
-        <w:t>מפעילה</w:t>
-      </w:r>
-      <w:r>
-        <w:rPr>
-          <w:rFonts w:ascii="David" w:hAnsi="David" w:cs="David"/>
-          <w:color w:val="111111"/>
-          <w:sz w:val="28"/>
-          <w:szCs w:val="28"/>
-          <w:rtl/>
-        </w:rPr>
-        <w:t xml:space="preserve"> PID </w:t>
-      </w:r>
       <w:proofErr w:type="spellStart"/>
       <w:r>
         <w:rPr>
-          <w:rFonts w:ascii="David" w:hAnsi="David" w:cs="David" w:hint="cs"/>
-          <w:color w:val="111111"/>
-          <w:sz w:val="28"/>
-          <w:szCs w:val="28"/>
-          <w:rtl/>
-        </w:rPr>
-        <w:t>לסבסוב</w:t>
+          <w:rFonts w:ascii="David" w:hAnsi="David" w:cs="David"/>
+          <w:color w:val="111111"/>
+          <w:sz w:val="28"/>
+          <w:szCs w:val="28"/>
+          <w:rtl/>
+        </w:rPr>
+        <w:t>Kp</w:t>
       </w:r>
       <w:proofErr w:type="spellEnd"/>
       <w:r>
@@ -6421,427 +6437,183 @@
           <w:szCs w:val="28"/>
           <w:rtl/>
         </w:rPr>
-        <w:t xml:space="preserve">, </w:t>
-      </w:r>
-      <w:r>
-        <w:rPr>
-          <w:rFonts w:ascii="David" w:hAnsi="David" w:cs="David" w:hint="cs"/>
-          <w:color w:val="111111"/>
-          <w:sz w:val="28"/>
-          <w:szCs w:val="28"/>
-          <w:rtl/>
-        </w:rPr>
-        <w:t>שגיאת</w:t>
-      </w:r>
-      <w:r>
-        <w:rPr>
-          <w:rFonts w:ascii="David" w:hAnsi="David" w:cs="David"/>
-          <w:color w:val="111111"/>
-          <w:sz w:val="28"/>
-          <w:szCs w:val="28"/>
-          <w:rtl/>
-        </w:rPr>
-        <w:t xml:space="preserve"> </w:t>
-      </w:r>
-      <w:r>
-        <w:rPr>
-          <w:rFonts w:ascii="David" w:hAnsi="David" w:cs="David" w:hint="cs"/>
-          <w:color w:val="111111"/>
-          <w:sz w:val="28"/>
-          <w:szCs w:val="28"/>
-          <w:rtl/>
-        </w:rPr>
-        <w:t>המיקום</w:t>
-      </w:r>
-      <w:r>
-        <w:rPr>
-          <w:rFonts w:ascii="David" w:hAnsi="David" w:cs="David"/>
-          <w:color w:val="111111"/>
-          <w:sz w:val="28"/>
-          <w:szCs w:val="28"/>
-          <w:rtl/>
-        </w:rPr>
-        <w:t xml:space="preserve"> </w:t>
-      </w:r>
-      <w:r>
-        <w:rPr>
-          <w:rFonts w:ascii="David" w:hAnsi="David" w:cs="David" w:hint="cs"/>
-          <w:color w:val="111111"/>
-          <w:sz w:val="28"/>
-          <w:szCs w:val="28"/>
-          <w:rtl/>
-        </w:rPr>
-        <w:t>האנכי</w:t>
-      </w:r>
-      <w:r>
-        <w:rPr>
-          <w:rFonts w:ascii="David" w:hAnsi="David" w:cs="David"/>
-          <w:color w:val="111111"/>
-          <w:sz w:val="28"/>
-          <w:szCs w:val="28"/>
-          <w:rtl/>
-        </w:rPr>
-        <w:t xml:space="preserve"> </w:t>
-      </w:r>
-      <w:r>
-        <w:rPr>
-          <w:rFonts w:ascii="David" w:hAnsi="David" w:cs="David" w:hint="cs"/>
-          <w:color w:val="111111"/>
-          <w:sz w:val="28"/>
-          <w:szCs w:val="28"/>
-          <w:rtl/>
-        </w:rPr>
-        <w:t>מפעילה</w:t>
-      </w:r>
-      <w:r>
-        <w:rPr>
-          <w:rFonts w:ascii="David" w:hAnsi="David" w:cs="David"/>
-          <w:color w:val="111111"/>
-          <w:sz w:val="28"/>
-          <w:szCs w:val="28"/>
-          <w:rtl/>
-        </w:rPr>
-        <w:t xml:space="preserve"> PID </w:t>
-      </w:r>
-      <w:r>
-        <w:rPr>
-          <w:rFonts w:ascii="David" w:hAnsi="David" w:cs="David" w:hint="cs"/>
-          <w:color w:val="111111"/>
-          <w:sz w:val="28"/>
-          <w:szCs w:val="28"/>
-          <w:rtl/>
-        </w:rPr>
-        <w:t>לגובה</w:t>
-      </w:r>
-      <w:r>
-        <w:rPr>
-          <w:rFonts w:ascii="David" w:hAnsi="David" w:cs="David"/>
-          <w:color w:val="111111"/>
-          <w:sz w:val="28"/>
-          <w:szCs w:val="28"/>
-          <w:rtl/>
-        </w:rPr>
-        <w:t xml:space="preserve">, </w:t>
-      </w:r>
-      <w:r>
-        <w:rPr>
-          <w:rFonts w:ascii="David" w:hAnsi="David" w:cs="David" w:hint="cs"/>
-          <w:color w:val="111111"/>
-          <w:sz w:val="28"/>
-          <w:szCs w:val="28"/>
-          <w:rtl/>
-        </w:rPr>
-        <w:t>ויחס</w:t>
-      </w:r>
-      <w:r>
-        <w:rPr>
-          <w:rFonts w:ascii="David" w:hAnsi="David" w:cs="David"/>
-          <w:color w:val="111111"/>
-          <w:sz w:val="28"/>
-          <w:szCs w:val="28"/>
-          <w:rtl/>
-        </w:rPr>
-        <w:t xml:space="preserve"> </w:t>
-      </w:r>
-      <w:r>
-        <w:rPr>
-          <w:rFonts w:ascii="David" w:hAnsi="David" w:cs="David" w:hint="cs"/>
-          <w:color w:val="111111"/>
-          <w:sz w:val="28"/>
-          <w:szCs w:val="28"/>
-          <w:rtl/>
-        </w:rPr>
-        <w:t>גובה</w:t>
-      </w:r>
-      <w:r>
-        <w:rPr>
-          <w:rFonts w:ascii="David" w:hAnsi="David" w:cs="David"/>
-          <w:color w:val="111111"/>
-          <w:sz w:val="28"/>
-          <w:szCs w:val="28"/>
-          <w:rtl/>
-        </w:rPr>
-        <w:t xml:space="preserve"> </w:t>
-      </w:r>
-      <w:r>
-        <w:rPr>
-          <w:rFonts w:ascii="David" w:hAnsi="David" w:cs="David" w:hint="cs"/>
-          <w:color w:val="111111"/>
-          <w:sz w:val="28"/>
-          <w:szCs w:val="28"/>
-          <w:rtl/>
-        </w:rPr>
-        <w:t>הפנים</w:t>
-      </w:r>
-      <w:r>
-        <w:rPr>
-          <w:rFonts w:ascii="David" w:hAnsi="David" w:cs="David"/>
-          <w:color w:val="111111"/>
-          <w:sz w:val="28"/>
-          <w:szCs w:val="28"/>
-          <w:rtl/>
-        </w:rPr>
-        <w:t xml:space="preserve"> </w:t>
-      </w:r>
-      <w:r>
-        <w:rPr>
-          <w:rFonts w:ascii="David" w:hAnsi="David" w:cs="David" w:hint="cs"/>
-          <w:color w:val="111111"/>
-          <w:sz w:val="28"/>
-          <w:szCs w:val="28"/>
-          <w:rtl/>
-        </w:rPr>
-        <w:t>לפריים</w:t>
-      </w:r>
-      <w:r>
-        <w:rPr>
-          <w:rFonts w:ascii="David" w:hAnsi="David" w:cs="David"/>
-          <w:color w:val="111111"/>
-          <w:sz w:val="28"/>
-          <w:szCs w:val="28"/>
-          <w:rtl/>
-        </w:rPr>
-        <w:t xml:space="preserve"> </w:t>
-      </w:r>
-      <w:r>
-        <w:rPr>
-          <w:rFonts w:ascii="David" w:hAnsi="David" w:cs="David" w:hint="cs"/>
-          <w:color w:val="111111"/>
-          <w:sz w:val="28"/>
-          <w:szCs w:val="28"/>
-          <w:rtl/>
-        </w:rPr>
-        <w:t>מפעיל</w:t>
-      </w:r>
-      <w:r>
-        <w:rPr>
-          <w:rFonts w:ascii="David" w:hAnsi="David" w:cs="David"/>
-          <w:color w:val="111111"/>
-          <w:sz w:val="28"/>
-          <w:szCs w:val="28"/>
-          <w:rtl/>
-        </w:rPr>
-        <w:t xml:space="preserve"> PID </w:t>
-      </w:r>
-      <w:r>
-        <w:rPr>
-          <w:rFonts w:ascii="David" w:hAnsi="David" w:cs="David" w:hint="cs"/>
-          <w:color w:val="111111"/>
-          <w:sz w:val="28"/>
-          <w:szCs w:val="28"/>
-          <w:rtl/>
-        </w:rPr>
-        <w:t>למרחק</w:t>
-      </w:r>
-      <w:r>
-        <w:rPr>
-          <w:rFonts w:ascii="David" w:hAnsi="David" w:cs="David"/>
-          <w:color w:val="111111"/>
-          <w:sz w:val="28"/>
-          <w:szCs w:val="28"/>
-          <w:rtl/>
-        </w:rPr>
-        <w:t xml:space="preserve">. </w:t>
-      </w:r>
-      <w:r>
-        <w:rPr>
-          <w:rFonts w:ascii="David" w:hAnsi="David" w:cs="David" w:hint="cs"/>
-          <w:color w:val="111111"/>
-          <w:sz w:val="28"/>
-          <w:szCs w:val="28"/>
-          <w:rtl/>
-        </w:rPr>
-        <w:t>הפלט</w:t>
-      </w:r>
-      <w:r>
-        <w:rPr>
-          <w:rFonts w:ascii="David" w:hAnsi="David" w:cs="David"/>
-          <w:color w:val="111111"/>
-          <w:sz w:val="28"/>
-          <w:szCs w:val="28"/>
-          <w:rtl/>
-        </w:rPr>
-        <w:t xml:space="preserve"> </w:t>
-      </w:r>
-      <w:r>
-        <w:rPr>
-          <w:rFonts w:ascii="David" w:hAnsi="David" w:cs="David" w:hint="cs"/>
-          <w:color w:val="111111"/>
-          <w:sz w:val="28"/>
-          <w:szCs w:val="28"/>
-          <w:rtl/>
-        </w:rPr>
-        <w:t>מוגבל</w:t>
-      </w:r>
-      <w:r>
-        <w:rPr>
-          <w:rFonts w:ascii="David" w:hAnsi="David" w:cs="David"/>
-          <w:color w:val="111111"/>
-          <w:sz w:val="28"/>
-          <w:szCs w:val="28"/>
-          <w:rtl/>
-        </w:rPr>
-        <w:t xml:space="preserve"> </w:t>
-      </w:r>
-      <w:r>
-        <w:rPr>
-          <w:rFonts w:ascii="David" w:hAnsi="David" w:cs="David" w:hint="cs"/>
-          <w:color w:val="111111"/>
-          <w:sz w:val="28"/>
-          <w:szCs w:val="28"/>
-          <w:rtl/>
-        </w:rPr>
-        <w:t>לטווח</w:t>
-      </w:r>
-      <w:r>
-        <w:rPr>
-          <w:rFonts w:ascii="David" w:hAnsi="David" w:cs="David"/>
-          <w:color w:val="111111"/>
-          <w:sz w:val="28"/>
-          <w:szCs w:val="28"/>
-          <w:rtl/>
-        </w:rPr>
-        <w:t xml:space="preserve"> [100,100</w:t>
-      </w:r>
-      <w:r>
-        <w:rPr>
-          <w:rFonts w:ascii="David" w:hAnsi="David" w:cs="David" w:hint="cs"/>
-          <w:color w:val="111111"/>
-          <w:sz w:val="28"/>
-          <w:szCs w:val="28"/>
-          <w:rtl/>
-        </w:rPr>
-        <w:t>-</w:t>
-      </w:r>
-      <w:r>
-        <w:rPr>
-          <w:rFonts w:ascii="David" w:hAnsi="David" w:cs="David"/>
-          <w:color w:val="111111"/>
-          <w:sz w:val="28"/>
-          <w:szCs w:val="28"/>
-          <w:rtl/>
-        </w:rPr>
-        <w:t xml:space="preserve">] </w:t>
-      </w:r>
-      <w:r>
-        <w:rPr>
-          <w:rFonts w:ascii="David" w:hAnsi="David" w:cs="David" w:hint="cs"/>
-          <w:color w:val="111111"/>
-          <w:sz w:val="28"/>
-          <w:szCs w:val="28"/>
-          <w:rtl/>
-        </w:rPr>
-        <w:t>ונשלח</w:t>
-      </w:r>
-      <w:r>
-        <w:rPr>
-          <w:rFonts w:ascii="David" w:hAnsi="David" w:cs="David"/>
-          <w:color w:val="111111"/>
-          <w:sz w:val="28"/>
-          <w:szCs w:val="28"/>
-          <w:rtl/>
-        </w:rPr>
-        <w:t xml:space="preserve"> </w:t>
-      </w:r>
-      <w:r>
-        <w:rPr>
-          <w:rFonts w:ascii="David" w:hAnsi="David" w:cs="David" w:hint="cs"/>
-          <w:color w:val="111111"/>
-          <w:sz w:val="28"/>
-          <w:szCs w:val="28"/>
-          <w:rtl/>
-        </w:rPr>
-        <w:t>כפקודות</w:t>
-      </w:r>
-      <w:r>
-        <w:rPr>
-          <w:rFonts w:ascii="David" w:hAnsi="David" w:cs="David"/>
-          <w:color w:val="111111"/>
-          <w:sz w:val="28"/>
-          <w:szCs w:val="28"/>
-          <w:rtl/>
-        </w:rPr>
-        <w:t xml:space="preserve"> RC </w:t>
-      </w:r>
-      <w:r>
-        <w:rPr>
-          <w:rFonts w:ascii="David" w:hAnsi="David" w:cs="David" w:hint="cs"/>
-          <w:color w:val="111111"/>
-          <w:sz w:val="28"/>
-          <w:szCs w:val="28"/>
-          <w:rtl/>
-        </w:rPr>
-        <w:t>לכל</w:t>
-      </w:r>
-      <w:r>
-        <w:rPr>
-          <w:rFonts w:ascii="David" w:hAnsi="David" w:cs="David"/>
-          <w:color w:val="111111"/>
-          <w:sz w:val="28"/>
-          <w:szCs w:val="28"/>
-          <w:rtl/>
-        </w:rPr>
-        <w:t xml:space="preserve"> </w:t>
-      </w:r>
-      <w:r>
-        <w:rPr>
-          <w:rFonts w:ascii="David" w:hAnsi="David" w:cs="David" w:hint="cs"/>
-          <w:color w:val="111111"/>
-          <w:sz w:val="28"/>
-          <w:szCs w:val="28"/>
-          <w:rtl/>
-        </w:rPr>
-        <w:t>היותר</w:t>
-      </w:r>
-      <w:r>
-        <w:rPr>
-          <w:rFonts w:ascii="David" w:hAnsi="David" w:cs="David"/>
-          <w:color w:val="111111"/>
-          <w:sz w:val="28"/>
-          <w:szCs w:val="28"/>
-          <w:rtl/>
-        </w:rPr>
-        <w:t xml:space="preserve"> </w:t>
-      </w:r>
-      <w:r>
-        <w:rPr>
-          <w:rFonts w:ascii="David" w:hAnsi="David" w:cs="David" w:hint="cs"/>
-          <w:color w:val="111111"/>
-          <w:sz w:val="28"/>
-          <w:szCs w:val="28"/>
-          <w:rtl/>
-        </w:rPr>
-        <w:t>פעם</w:t>
-      </w:r>
-      <w:r>
-        <w:rPr>
-          <w:rFonts w:ascii="David" w:hAnsi="David" w:cs="David"/>
-          <w:color w:val="111111"/>
-          <w:sz w:val="28"/>
-          <w:szCs w:val="28"/>
-          <w:rtl/>
-        </w:rPr>
-        <w:t xml:space="preserve"> </w:t>
-      </w:r>
-      <w:r>
-        <w:rPr>
-          <w:rFonts w:ascii="David" w:hAnsi="David" w:cs="David" w:hint="cs"/>
-          <w:color w:val="111111"/>
-          <w:sz w:val="28"/>
-          <w:szCs w:val="28"/>
-          <w:rtl/>
-        </w:rPr>
-        <w:t>ב</w:t>
-      </w:r>
-      <w:r>
-        <w:rPr>
-          <w:rFonts w:ascii="David" w:hAnsi="David" w:cs="David"/>
-          <w:color w:val="111111"/>
-          <w:sz w:val="28"/>
-          <w:szCs w:val="28"/>
-          <w:rtl/>
-        </w:rPr>
-        <w:t>-50ms.</w:t>
+        <w:t xml:space="preserve">=2.2, </w:t>
+      </w:r>
+      <w:proofErr w:type="spellStart"/>
+      <w:r>
+        <w:rPr>
+          <w:rFonts w:ascii="David" w:hAnsi="David" w:cs="David"/>
+          <w:color w:val="111111"/>
+          <w:sz w:val="28"/>
+          <w:szCs w:val="28"/>
+          <w:rtl/>
+        </w:rPr>
+        <w:t>Ki</w:t>
+      </w:r>
+      <w:proofErr w:type="spellEnd"/>
+      <w:r>
+        <w:rPr>
+          <w:rFonts w:ascii="David" w:hAnsi="David" w:cs="David"/>
+          <w:color w:val="111111"/>
+          <w:sz w:val="28"/>
+          <w:szCs w:val="28"/>
+          <w:rtl/>
+        </w:rPr>
+        <w:t xml:space="preserve">=0.0, </w:t>
+      </w:r>
+      <w:proofErr w:type="spellStart"/>
+      <w:r>
+        <w:rPr>
+          <w:rFonts w:ascii="David" w:hAnsi="David" w:cs="David"/>
+          <w:color w:val="111111"/>
+          <w:sz w:val="28"/>
+          <w:szCs w:val="28"/>
+          <w:rtl/>
+        </w:rPr>
+        <w:t>Kd</w:t>
+      </w:r>
+      <w:proofErr w:type="spellEnd"/>
+      <w:r>
+        <w:rPr>
+          <w:rFonts w:ascii="David" w:hAnsi="David" w:cs="David"/>
+          <w:color w:val="111111"/>
+          <w:sz w:val="28"/>
+          <w:szCs w:val="28"/>
+          <w:rtl/>
+        </w:rPr>
+        <w:t xml:space="preserve">=0.02; למרחק </w:t>
+      </w:r>
+      <w:proofErr w:type="spellStart"/>
+      <w:r>
+        <w:rPr>
+          <w:rFonts w:ascii="David" w:hAnsi="David" w:cs="David"/>
+          <w:color w:val="111111"/>
+          <w:sz w:val="28"/>
+          <w:szCs w:val="28"/>
+          <w:rtl/>
+        </w:rPr>
+        <w:t>Kp</w:t>
+      </w:r>
+      <w:proofErr w:type="spellEnd"/>
+      <w:r>
+        <w:rPr>
+          <w:rFonts w:ascii="David" w:hAnsi="David" w:cs="David"/>
+          <w:color w:val="111111"/>
+          <w:sz w:val="28"/>
+          <w:szCs w:val="28"/>
+          <w:rtl/>
+        </w:rPr>
+        <w:t xml:space="preserve">=2.6, </w:t>
+      </w:r>
+      <w:proofErr w:type="spellStart"/>
+      <w:r>
+        <w:rPr>
+          <w:rFonts w:ascii="David" w:hAnsi="David" w:cs="David"/>
+          <w:color w:val="111111"/>
+          <w:sz w:val="28"/>
+          <w:szCs w:val="28"/>
+          <w:rtl/>
+        </w:rPr>
+        <w:t>Ki</w:t>
+      </w:r>
+      <w:proofErr w:type="spellEnd"/>
+      <w:r>
+        <w:rPr>
+          <w:rFonts w:ascii="David" w:hAnsi="David" w:cs="David"/>
+          <w:color w:val="111111"/>
+          <w:sz w:val="28"/>
+          <w:szCs w:val="28"/>
+          <w:rtl/>
+        </w:rPr>
+        <w:t xml:space="preserve">=0.0, </w:t>
+      </w:r>
+      <w:proofErr w:type="spellStart"/>
+      <w:r>
+        <w:rPr>
+          <w:rFonts w:ascii="David" w:hAnsi="David" w:cs="David"/>
+          <w:color w:val="111111"/>
+          <w:sz w:val="28"/>
+          <w:szCs w:val="28"/>
+          <w:rtl/>
+        </w:rPr>
+        <w:t>Kd</w:t>
+      </w:r>
+      <w:proofErr w:type="spellEnd"/>
+      <w:r>
+        <w:rPr>
+          <w:rFonts w:ascii="David" w:hAnsi="David" w:cs="David"/>
+          <w:color w:val="111111"/>
+          <w:sz w:val="28"/>
+          <w:szCs w:val="28"/>
+          <w:rtl/>
+        </w:rPr>
+        <w:t xml:space="preserve">=0.04; ולגובה </w:t>
+      </w:r>
+      <w:proofErr w:type="spellStart"/>
+      <w:r>
+        <w:rPr>
+          <w:rFonts w:ascii="David" w:hAnsi="David" w:cs="David"/>
+          <w:color w:val="111111"/>
+          <w:sz w:val="28"/>
+          <w:szCs w:val="28"/>
+          <w:rtl/>
+        </w:rPr>
+        <w:t>Kp</w:t>
+      </w:r>
+      <w:proofErr w:type="spellEnd"/>
+      <w:r>
+        <w:rPr>
+          <w:rFonts w:ascii="David" w:hAnsi="David" w:cs="David"/>
+          <w:color w:val="111111"/>
+          <w:sz w:val="28"/>
+          <w:szCs w:val="28"/>
+          <w:rtl/>
+        </w:rPr>
+        <w:t xml:space="preserve">=1.6, </w:t>
+      </w:r>
+      <w:proofErr w:type="spellStart"/>
+      <w:r>
+        <w:rPr>
+          <w:rFonts w:ascii="David" w:hAnsi="David" w:cs="David"/>
+          <w:color w:val="111111"/>
+          <w:sz w:val="28"/>
+          <w:szCs w:val="28"/>
+          <w:rtl/>
+        </w:rPr>
+        <w:t>Ki</w:t>
+      </w:r>
+      <w:proofErr w:type="spellEnd"/>
+      <w:r>
+        <w:rPr>
+          <w:rFonts w:ascii="David" w:hAnsi="David" w:cs="David"/>
+          <w:color w:val="111111"/>
+          <w:sz w:val="28"/>
+          <w:szCs w:val="28"/>
+          <w:rtl/>
+        </w:rPr>
+        <w:t xml:space="preserve">=0.0, </w:t>
+      </w:r>
+      <w:proofErr w:type="spellStart"/>
+      <w:r>
+        <w:rPr>
+          <w:rFonts w:ascii="David" w:hAnsi="David" w:cs="David"/>
+          <w:color w:val="111111"/>
+          <w:sz w:val="28"/>
+          <w:szCs w:val="28"/>
+          <w:rtl/>
+        </w:rPr>
+        <w:t>Kd</w:t>
+      </w:r>
+      <w:proofErr w:type="spellEnd"/>
+      <w:r>
+        <w:rPr>
+          <w:rFonts w:ascii="David" w:hAnsi="David" w:cs="David"/>
+          <w:color w:val="111111"/>
+          <w:sz w:val="28"/>
+          <w:szCs w:val="28"/>
+          <w:rtl/>
+        </w:rPr>
+        <w:t>=0.02.</w:t>
       </w:r>
     </w:p>
     <w:p>
@@ -6864,33 +6636,67 @@
           <w:szCs w:val="28"/>
           <w:rtl/>
         </w:rPr>
-        <w:t>קיימים</w:t>
-      </w:r>
-      <w:r>
-        <w:rPr>
-          <w:rFonts w:ascii="David" w:hAnsi="David" w:cs="David"/>
-          <w:color w:val="111111"/>
-          <w:sz w:val="28"/>
-          <w:szCs w:val="28"/>
-          <w:rtl/>
-        </w:rPr>
-        <w:t xml:space="preserve"> C</w:t>
+        <w:t xml:space="preserve">קיים </w:t>
       </w:r>
       <w:proofErr w:type="spellStart"/>
       <w:r>
         <w:rPr>
-          <w:rFonts w:ascii="David" w:hAnsi="David" w:cs="David"/>
-          <w:color w:val="111111"/>
-          <w:sz w:val="28"/>
-          <w:szCs w:val="28"/>
-          <w:rtl/>
-        </w:rPr>
-        <w:t>ooldown</w:t>
+          <w:rFonts w:ascii="David" w:hAnsi="David" w:cs="David" w:hint="cs"/>
+          <w:color w:val="111111"/>
+          <w:sz w:val="28"/>
+          <w:szCs w:val="28"/>
+          <w:rtl/>
+        </w:rPr>
+        <w:t>Cooldown</w:t>
       </w:r>
       <w:proofErr w:type="spellEnd"/>
       <w:r>
         <w:rPr>
-          <w:rFonts w:ascii="David" w:hAnsi="David" w:cs="David"/>
+          <w:rFonts w:ascii="David" w:hAnsi="David" w:cs="David" w:hint="cs"/>
+          <w:color w:val="111111"/>
+          <w:sz w:val="28"/>
+          <w:szCs w:val="28"/>
+          <w:rtl/>
+        </w:rPr>
+        <w:t xml:space="preserve"> מרכזי של 0.45 שניות לאחר קבלת פקודת טיסה, כדי למנוע ביצוע חוזר ומהיר של פעולות. פקודות </w:t>
+      </w:r>
+      <w:proofErr w:type="spellStart"/>
+      <w:r>
+        <w:rPr>
+          <w:rFonts w:ascii="David" w:hAnsi="David" w:cs="David" w:hint="cs"/>
+          <w:color w:val="111111"/>
+          <w:sz w:val="28"/>
+          <w:szCs w:val="28"/>
+          <w:rtl/>
+        </w:rPr>
+        <w:t>Land</w:t>
+      </w:r>
+      <w:proofErr w:type="spellEnd"/>
+      <w:r>
+        <w:rPr>
+          <w:rFonts w:ascii="David" w:hAnsi="David" w:cs="David" w:hint="cs"/>
+          <w:color w:val="111111"/>
+          <w:sz w:val="28"/>
+          <w:szCs w:val="28"/>
+          <w:rtl/>
+        </w:rPr>
+        <w:t xml:space="preserve"> ו-</w:t>
+      </w:r>
+      <w:proofErr w:type="spellStart"/>
+      <w:r>
+        <w:rPr>
+          <w:rFonts w:ascii="David" w:hAnsi="David" w:cs="David" w:hint="cs"/>
+          <w:color w:val="111111"/>
+          <w:sz w:val="28"/>
+          <w:szCs w:val="28"/>
+          <w:rtl/>
+        </w:rPr>
+        <w:t>Stop</w:t>
+      </w:r>
+      <w:proofErr w:type="spellEnd"/>
+      <w:r>
+        <w:rPr>
+          <w:rFonts w:ascii="David" w:hAnsi="David" w:cs="David" w:hint="cs"/>
           <w:color w:val="111111"/>
           <w:sz w:val="28"/>
           <w:szCs w:val="28"/>
@@ -6898,6 +6704,7 @@
         </w:rPr>
         <w:t xml:space="preserve"> </w:t>
       </w:r>
+      <w:proofErr w:type="spellStart"/>
       <w:r>
         <w:rPr>
           <w:rFonts w:ascii="David" w:hAnsi="David" w:cs="David" w:hint="cs"/>
@@ -6906,18 +6713,9 @@
           <w:szCs w:val="28"/>
           <w:rtl/>
         </w:rPr>
-        <w:t>מרכזי</w:t>
-      </w:r>
-      <w:r>
-        <w:rPr>
-          <w:rFonts w:ascii="David" w:hAnsi="David" w:cs="David"/>
-          <w:color w:val="111111"/>
-          <w:sz w:val="28"/>
-          <w:szCs w:val="28"/>
-          <w:rtl/>
-        </w:rPr>
-        <w:t xml:space="preserve">, </w:t>
-      </w:r>
+        <w:t>Follow</w:t>
+      </w:r>
+      <w:proofErr w:type="spellEnd"/>
       <w:r>
         <w:rPr>
           <w:rFonts w:ascii="David" w:hAnsi="David" w:cs="David" w:hint="cs"/>
@@ -6926,18 +6724,9 @@
           <w:szCs w:val="28"/>
           <w:rtl/>
         </w:rPr>
-        <w:t>נעילה</w:t>
-      </w:r>
-      <w:r>
-        <w:rPr>
-          <w:rFonts w:ascii="David" w:hAnsi="David" w:cs="David"/>
-          <w:color w:val="111111"/>
-          <w:sz w:val="28"/>
-          <w:szCs w:val="28"/>
-          <w:rtl/>
-        </w:rPr>
-        <w:t xml:space="preserve"> </w:t>
-      </w:r>
+        <w:t xml:space="preserve"> פטורות מה-</w:t>
+      </w:r>
+      <w:proofErr w:type="spellStart"/>
       <w:r>
         <w:rPr>
           <w:rFonts w:ascii="David" w:hAnsi="David" w:cs="David" w:hint="cs"/>
@@ -6946,18 +6735,9 @@
           <w:szCs w:val="28"/>
           <w:rtl/>
         </w:rPr>
-        <w:t>של</w:t>
-      </w:r>
-      <w:r>
-        <w:rPr>
-          <w:rFonts w:ascii="David" w:hAnsi="David" w:cs="David"/>
-          <w:color w:val="111111"/>
-          <w:sz w:val="28"/>
-          <w:szCs w:val="28"/>
-          <w:rtl/>
-        </w:rPr>
-        <w:t xml:space="preserve"> </w:t>
-      </w:r>
+        <w:t>Cooldown</w:t>
+      </w:r>
+      <w:proofErr w:type="spellEnd"/>
       <w:r>
         <w:rPr>
           <w:rFonts w:ascii="David" w:hAnsi="David" w:cs="David" w:hint="cs"/>
@@ -6966,18 +6746,9 @@
           <w:szCs w:val="28"/>
           <w:rtl/>
         </w:rPr>
-        <w:t>שלוש</w:t>
-      </w:r>
-      <w:r>
-        <w:rPr>
-          <w:rFonts w:ascii="David" w:hAnsi="David" w:cs="David"/>
-          <w:color w:val="111111"/>
-          <w:sz w:val="28"/>
-          <w:szCs w:val="28"/>
-          <w:rtl/>
-        </w:rPr>
-        <w:t xml:space="preserve"> </w:t>
-      </w:r>
+        <w:t xml:space="preserve">. לאחר השלמה מוצלחת של </w:t>
+      </w:r>
+      <w:proofErr w:type="spellStart"/>
       <w:r>
         <w:rPr>
           <w:rFonts w:ascii="David" w:hAnsi="David" w:cs="David" w:hint="cs"/>
@@ -6986,18 +6757,9 @@
           <w:szCs w:val="28"/>
           <w:rtl/>
         </w:rPr>
-        <w:t>שניות</w:t>
-      </w:r>
-      <w:r>
-        <w:rPr>
-          <w:rFonts w:ascii="David" w:hAnsi="David" w:cs="David"/>
-          <w:color w:val="111111"/>
-          <w:sz w:val="28"/>
-          <w:szCs w:val="28"/>
-          <w:rtl/>
-        </w:rPr>
-        <w:t xml:space="preserve"> </w:t>
-      </w:r>
+        <w:t>Flip</w:t>
+      </w:r>
+      <w:proofErr w:type="spellEnd"/>
       <w:r>
         <w:rPr>
           <w:rFonts w:ascii="David" w:hAnsi="David" w:cs="David" w:hint="cs"/>
@@ -7006,159 +6768,29 @@
           <w:szCs w:val="28"/>
           <w:rtl/>
         </w:rPr>
-        <w:t>לאחר</w:t>
-      </w:r>
-      <w:r>
-        <w:rPr>
-          <w:rFonts w:ascii="David" w:hAnsi="David" w:cs="David"/>
-          <w:color w:val="111111"/>
-          <w:sz w:val="28"/>
-          <w:szCs w:val="28"/>
-          <w:rtl/>
-        </w:rPr>
-        <w:t xml:space="preserve"> </w:t>
+        <w:t xml:space="preserve"> מופעלת נעילת התאוששות של 1.25 שניות; בזמן הנעילה כל פקודות הטיסה נחסמות מלבד </w:t>
       </w:r>
       <w:proofErr w:type="spellStart"/>
       <w:r>
         <w:rPr>
-          <w:rFonts w:ascii="David" w:hAnsi="David" w:cs="David"/>
-          <w:color w:val="111111"/>
-          <w:sz w:val="28"/>
-          <w:szCs w:val="28"/>
-          <w:rtl/>
-        </w:rPr>
-        <w:t>Flip</w:t>
+          <w:rFonts w:ascii="David" w:hAnsi="David" w:cs="David" w:hint="cs"/>
+          <w:color w:val="111111"/>
+          <w:sz w:val="28"/>
+          <w:szCs w:val="28"/>
+          <w:rtl/>
+        </w:rPr>
+        <w:t>Land</w:t>
       </w:r>
       <w:proofErr w:type="spellEnd"/>
       <w:r>
         <w:rPr>
-          <w:rFonts w:ascii="David" w:hAnsi="David" w:cs="David"/>
-          <w:color w:val="111111"/>
-          <w:sz w:val="28"/>
-          <w:szCs w:val="28"/>
-          <w:rtl/>
-        </w:rPr>
-        <w:t xml:space="preserve">, </w:t>
-      </w:r>
-      <w:r>
-        <w:rPr>
           <w:rFonts w:ascii="David" w:hAnsi="David" w:cs="David" w:hint="cs"/>
           <w:color w:val="111111"/>
           <w:sz w:val="28"/>
           <w:szCs w:val="28"/>
           <w:rtl/>
         </w:rPr>
-        <w:t>קדימויות</w:t>
-      </w:r>
-      <w:r>
-        <w:rPr>
-          <w:rFonts w:ascii="David" w:hAnsi="David" w:cs="David"/>
-          <w:color w:val="111111"/>
-          <w:sz w:val="28"/>
-          <w:szCs w:val="28"/>
-          <w:rtl/>
-        </w:rPr>
-        <w:t xml:space="preserve"> </w:t>
-      </w:r>
-      <w:r>
-        <w:rPr>
-          <w:rFonts w:ascii="David" w:hAnsi="David" w:cs="David" w:hint="cs"/>
-          <w:color w:val="111111"/>
-          <w:sz w:val="28"/>
-          <w:szCs w:val="28"/>
-          <w:rtl/>
-        </w:rPr>
-        <w:t>לפקודות</w:t>
-      </w:r>
-      <w:r>
-        <w:rPr>
-          <w:rFonts w:ascii="David" w:hAnsi="David" w:cs="David"/>
-          <w:color w:val="111111"/>
-          <w:sz w:val="28"/>
-          <w:szCs w:val="28"/>
-          <w:rtl/>
-        </w:rPr>
-        <w:t xml:space="preserve"> </w:t>
-      </w:r>
-      <w:r>
-        <w:rPr>
-          <w:rFonts w:ascii="David" w:hAnsi="David" w:cs="David" w:hint="cs"/>
-          <w:color w:val="111111"/>
-          <w:sz w:val="28"/>
-          <w:szCs w:val="28"/>
-          <w:rtl/>
-        </w:rPr>
-        <w:t>ונחיתת</w:t>
-      </w:r>
-      <w:r>
-        <w:rPr>
-          <w:rFonts w:ascii="David" w:hAnsi="David" w:cs="David"/>
-          <w:color w:val="111111"/>
-          <w:sz w:val="28"/>
-          <w:szCs w:val="28"/>
-          <w:rtl/>
-        </w:rPr>
-        <w:t xml:space="preserve"> </w:t>
-      </w:r>
-      <w:r>
-        <w:rPr>
-          <w:rFonts w:ascii="David" w:hAnsi="David" w:cs="David" w:hint="cs"/>
-          <w:color w:val="111111"/>
-          <w:sz w:val="28"/>
-          <w:szCs w:val="28"/>
-          <w:rtl/>
-        </w:rPr>
-        <w:t>חירום</w:t>
-      </w:r>
-      <w:r>
-        <w:rPr>
-          <w:rFonts w:ascii="David" w:hAnsi="David" w:cs="David"/>
-          <w:color w:val="111111"/>
-          <w:sz w:val="28"/>
-          <w:szCs w:val="28"/>
-          <w:rtl/>
-        </w:rPr>
-        <w:t xml:space="preserve"> </w:t>
-      </w:r>
-      <w:r>
-        <w:rPr>
-          <w:rFonts w:ascii="David" w:hAnsi="David" w:cs="David" w:hint="cs"/>
-          <w:color w:val="111111"/>
-          <w:sz w:val="28"/>
-          <w:szCs w:val="28"/>
-          <w:rtl/>
-        </w:rPr>
-        <w:t>בעת</w:t>
-      </w:r>
-      <w:r>
-        <w:rPr>
-          <w:rFonts w:ascii="David" w:hAnsi="David" w:cs="David"/>
-          <w:color w:val="111111"/>
-          <w:sz w:val="28"/>
-          <w:szCs w:val="28"/>
-          <w:rtl/>
-        </w:rPr>
-        <w:t xml:space="preserve"> </w:t>
-      </w:r>
-      <w:r>
-        <w:rPr>
-          <w:rFonts w:ascii="David" w:hAnsi="David" w:cs="David" w:hint="cs"/>
-          <w:color w:val="111111"/>
-          <w:sz w:val="28"/>
-          <w:szCs w:val="28"/>
-          <w:rtl/>
-        </w:rPr>
-        <w:t>סגירה</w:t>
-      </w:r>
-      <w:r>
-        <w:rPr>
-          <w:rFonts w:ascii="David" w:hAnsi="David" w:cs="David"/>
-          <w:color w:val="111111"/>
-          <w:sz w:val="28"/>
-          <w:szCs w:val="28"/>
-          <w:rtl/>
-        </w:rPr>
-        <w:t>.</w:t>
+        <w:t>, כך שתמיד ניתן לבצע נחיתת חירום.</w:t>
       </w:r>
     </w:p>
     <w:p>
@@ -7723,7 +7355,7 @@
                 <w:szCs w:val="28"/>
                 <w:rtl/>
               </w:rPr>
-              <w:t>Like</w:t>
+              <w:t>Call</w:t>
             </w:r>
             <w:proofErr w:type="spellEnd"/>
             <w:r>
@@ -8428,7 +8060,6 @@
                 <w:szCs w:val="28"/>
               </w:rPr>
             </w:pPr>
-            <w:proofErr w:type="spellStart"/>
             <w:r>
               <w:rPr>
                 <w:rFonts w:ascii="David" w:hAnsi="David" w:cs="David"/>
@@ -8437,18 +8068,7 @@
                 <w:szCs w:val="28"/>
                 <w:rtl/>
               </w:rPr>
-              <w:t>Rock</w:t>
-            </w:r>
-            <w:proofErr w:type="spellEnd"/>
-            <w:r>
-              <w:rPr>
-                <w:rFonts w:ascii="David" w:hAnsi="David" w:cs="David"/>
-                <w:color w:val="111111"/>
-                <w:sz w:val="28"/>
-                <w:szCs w:val="28"/>
-                <w:rtl/>
-              </w:rPr>
-              <w:t>: קדימה</w:t>
+              <w:t>—</w:t>
             </w:r>
           </w:p>
         </w:tc>
@@ -8482,6 +8102,28 @@
                 <w:szCs w:val="28"/>
                 <w:rtl/>
               </w:rPr>
+              <w:t>flip</w:t>
+            </w:r>
+            <w:proofErr w:type="spellEnd"/>
+            <w:r>
+              <w:rPr>
+                <w:rFonts w:ascii="David" w:hAnsi="David" w:cs="David"/>
+                <w:color w:val="111111"/>
+                <w:sz w:val="28"/>
+                <w:szCs w:val="28"/>
+                <w:rtl/>
+              </w:rPr>
+              <w:t xml:space="preserve"> </w:t>
+            </w:r>
+            <w:proofErr w:type="spellStart"/>
+            <w:r>
+              <w:rPr>
+                <w:rFonts w:ascii="David" w:hAnsi="David" w:cs="David"/>
+                <w:color w:val="111111"/>
+                <w:sz w:val="28"/>
+                <w:szCs w:val="28"/>
+                <w:rtl/>
+              </w:rPr>
               <w:t>forward</w:t>
             </w:r>
             <w:proofErr w:type="spellEnd"/>
@@ -8504,6 +8146,28 @@
                 <w:szCs w:val="28"/>
                 <w:rtl/>
               </w:rPr>
+              <w:t>flip</w:t>
+            </w:r>
+            <w:proofErr w:type="spellEnd"/>
+            <w:r>
+              <w:rPr>
+                <w:rFonts w:ascii="David" w:hAnsi="David" w:cs="David"/>
+                <w:color w:val="111111"/>
+                <w:sz w:val="28"/>
+                <w:szCs w:val="28"/>
+                <w:rtl/>
+              </w:rPr>
+              <w:t xml:space="preserve"> </w:t>
+            </w:r>
+            <w:proofErr w:type="spellStart"/>
+            <w:r>
+              <w:rPr>
+                <w:rFonts w:ascii="David" w:hAnsi="David" w:cs="David"/>
+                <w:color w:val="111111"/>
+                <w:sz w:val="28"/>
+                <w:szCs w:val="28"/>
+                <w:rtl/>
+              </w:rPr>
               <w:t>back</w:t>
             </w:r>
             <w:proofErr w:type="spellEnd"/>
@@ -8526,6 +8190,28 @@
                 <w:szCs w:val="28"/>
                 <w:rtl/>
               </w:rPr>
+              <w:t>flip</w:t>
+            </w:r>
+            <w:proofErr w:type="spellEnd"/>
+            <w:r>
+              <w:rPr>
+                <w:rFonts w:ascii="David" w:hAnsi="David" w:cs="David"/>
+                <w:color w:val="111111"/>
+                <w:sz w:val="28"/>
+                <w:szCs w:val="28"/>
+                <w:rtl/>
+              </w:rPr>
+              <w:t xml:space="preserve"> </w:t>
+            </w:r>
+            <w:proofErr w:type="spellStart"/>
+            <w:r>
+              <w:rPr>
+                <w:rFonts w:ascii="David" w:hAnsi="David" w:cs="David"/>
+                <w:color w:val="111111"/>
+                <w:sz w:val="28"/>
+                <w:szCs w:val="28"/>
+                <w:rtl/>
+              </w:rPr>
               <w:t>left</w:t>
             </w:r>
             <w:proofErr w:type="spellEnd"/>
@@ -8538,6 +8224,28 @@
                 <w:rtl/>
               </w:rPr>
               <w:t xml:space="preserve"> / </w:t>
+            </w:r>
+            <w:proofErr w:type="spellStart"/>
+            <w:r>
+              <w:rPr>
+                <w:rFonts w:ascii="David" w:hAnsi="David" w:cs="David"/>
+                <w:color w:val="111111"/>
+                <w:sz w:val="28"/>
+                <w:szCs w:val="28"/>
+                <w:rtl/>
+              </w:rPr>
+              <w:t>flip</w:t>
+            </w:r>
+            <w:proofErr w:type="spellEnd"/>
+            <w:r>
+              <w:rPr>
+                <w:rFonts w:ascii="David" w:hAnsi="David" w:cs="David"/>
+                <w:color w:val="111111"/>
+                <w:sz w:val="28"/>
+                <w:szCs w:val="28"/>
+                <w:rtl/>
+              </w:rPr>
+              <w:t xml:space="preserve"> </w:t>
             </w:r>
             <w:proofErr w:type="spellStart"/>
             <w:r>
@@ -8611,7 +8319,6 @@
                 <w:szCs w:val="28"/>
               </w:rPr>
             </w:pPr>
-            <w:proofErr w:type="spellStart"/>
             <w:r>
               <w:rPr>
                 <w:rFonts w:ascii="David" w:hAnsi="David" w:cs="David"/>
@@ -8620,18 +8327,7 @@
                 <w:szCs w:val="28"/>
                 <w:rtl/>
               </w:rPr>
-              <w:t>Call</w:t>
-            </w:r>
-            <w:proofErr w:type="spellEnd"/>
-            <w:r>
-              <w:rPr>
-                <w:rFonts w:ascii="David" w:hAnsi="David" w:cs="David"/>
-                <w:color w:val="111111"/>
-                <w:sz w:val="28"/>
-                <w:szCs w:val="28"/>
-                <w:rtl/>
-              </w:rPr>
-              <w:t>: מעבר לקול</w:t>
+              <w:t>—</w:t>
             </w:r>
           </w:p>
         </w:tc>
@@ -9753,27 +9449,51 @@
           <w:szCs w:val="28"/>
           <w:rtl/>
         </w:rPr>
-        <w:t xml:space="preserve"> דורש לפחות 50% סוללה ומרחק בטוח מהרצפה</w:t>
-      </w:r>
-      <w:r>
-        <w:rPr>
-          <w:rFonts w:ascii="David" w:hAnsi="David" w:cs="David" w:hint="cs"/>
-          <w:color w:val="111111"/>
-          <w:sz w:val="28"/>
-          <w:szCs w:val="28"/>
-          <w:rtl/>
-        </w:rPr>
-        <w:t>,</w:t>
-      </w:r>
-      <w:r>
-        <w:rPr>
-          <w:rFonts w:ascii="David" w:hAnsi="David" w:cs="David"/>
-          <w:color w:val="111111"/>
-          <w:sz w:val="28"/>
-          <w:szCs w:val="28"/>
-          <w:rtl/>
-        </w:rPr>
-        <w:t xml:space="preserve"> לאחריו מופעלת נעילת התאוששות.</w:t>
+        <w:t xml:space="preserve"> דורש לפחות 50% סוללה ומרחק בטוח מהרצפה. לאחר שה-</w:t>
+      </w:r>
+      <w:proofErr w:type="spellStart"/>
+      <w:r>
+        <w:rPr>
+          <w:rFonts w:ascii="David" w:hAnsi="David" w:cs="David"/>
+          <w:color w:val="111111"/>
+          <w:sz w:val="28"/>
+          <w:szCs w:val="28"/>
+          <w:rtl/>
+        </w:rPr>
+        <w:t>Flip</w:t>
+      </w:r>
+      <w:proofErr w:type="spellEnd"/>
+      <w:r>
+        <w:rPr>
+          <w:rFonts w:ascii="David" w:hAnsi="David" w:cs="David"/>
+          <w:color w:val="111111"/>
+          <w:sz w:val="28"/>
+          <w:szCs w:val="28"/>
+          <w:rtl/>
+        </w:rPr>
+        <w:t xml:space="preserve"> מסתיים מופעלת נעילת התאוששות של 1.25 שניות, שבמהלכה רק פקודת </w:t>
+      </w:r>
+      <w:proofErr w:type="spellStart"/>
+      <w:r>
+        <w:rPr>
+          <w:rFonts w:ascii="David" w:hAnsi="David" w:cs="David"/>
+          <w:color w:val="111111"/>
+          <w:sz w:val="28"/>
+          <w:szCs w:val="28"/>
+          <w:rtl/>
+        </w:rPr>
+        <w:t>Land</w:t>
+      </w:r>
+      <w:proofErr w:type="spellEnd"/>
+      <w:r>
+        <w:rPr>
+          <w:rFonts w:ascii="David" w:hAnsi="David" w:cs="David"/>
+          <w:color w:val="111111"/>
+          <w:sz w:val="28"/>
+          <w:szCs w:val="28"/>
+          <w:rtl/>
+        </w:rPr>
+        <w:t xml:space="preserve"> נשארת זמינה.</w:t>
       </w:r>
     </w:p>
     <w:p>
@@ -9931,34 +9651,29 @@
           <w:szCs w:val="28"/>
           <w:rtl/>
         </w:rPr>
-        <w:t>חיישני האינפרה-אדום התחתונים לא שולבו במערכת</w:t>
-      </w:r>
-    </w:p>
-    <w:p>
-      <w:pPr>
-        <w:pStyle w:val="ListBullet"/>
-        <w:numPr>
-          <w:ilvl w:val="0"/>
-          <w:numId w:val="0"/>
-        </w:numPr>
-        <w:bidi/>
-        <w:spacing w:after="40" w:line="360" w:lineRule="auto"/>
-        <w:ind w:left="360" w:right="259"/>
-        <w:rPr>
-          <w:rFonts w:ascii="David" w:hAnsi="David" w:cs="David"/>
-          <w:sz w:val="28"/>
-          <w:szCs w:val="28"/>
-        </w:rPr>
-      </w:pPr>
-      <w:r>
-        <w:rPr>
-          <w:rFonts w:ascii="David" w:hAnsi="David" w:cs="David"/>
-          <w:color w:val="111111"/>
-          <w:sz w:val="28"/>
-          <w:szCs w:val="28"/>
-          <w:rtl/>
-        </w:rPr>
-        <w:t xml:space="preserve"> בממשק החומרה שנבדק לא התאפשר להשתמש בהם במקביל לזרם המצלמה הרגיל.</w:t>
+        <w:t xml:space="preserve">יש לטוס מעל רצפה מוארת, מט ולא אחידה, בעלת מרקם ופרטים חזותיים, כדי שהמצלמה התחתונה וחיישני האינפרה-אדום יוכלו לייצב את </w:t>
+      </w:r>
+      <w:proofErr w:type="spellStart"/>
+      <w:r>
+        <w:rPr>
+          <w:rFonts w:ascii="David" w:hAnsi="David" w:cs="David"/>
+          <w:color w:val="111111"/>
+          <w:sz w:val="28"/>
+          <w:szCs w:val="28"/>
+          <w:rtl/>
+        </w:rPr>
+        <w:t>הרחפן</w:t>
+      </w:r>
+      <w:proofErr w:type="spellEnd"/>
+      <w:r>
+        <w:rPr>
+          <w:rFonts w:ascii="David" w:hAnsi="David" w:cs="David"/>
+          <w:color w:val="111111"/>
+          <w:sz w:val="28"/>
+          <w:szCs w:val="28"/>
+          <w:rtl/>
+        </w:rPr>
+        <w:t>. רצפה מבריקה, כהה או אחידה עלולה להפחית את דיוק המיקום ולגרום לסחיפה.</w:t>
       </w:r>
     </w:p>
     <w:p>
@@ -10050,7 +9765,7 @@
           <w:szCs w:val="28"/>
           <w:rtl/>
         </w:rPr>
-        <w:t xml:space="preserve"> פעל ללא אינטרנט ולא הושפע משמעותית מרעש המנועים כאשר המשתמש דיבר קרוב למיקרופון. מגבלה מעשית היא </w:t>
+        <w:t xml:space="preserve"> פעל ללא אינטרנט ולא הושפע משמעותית מרעש המנועים כאשר המשתמש דיבר קרוב למיקרופון. בעת </w:t>
       </w:r>
       <w:proofErr w:type="spellStart"/>
       <w:r>
@@ -10061,6 +9776,28 @@
           <w:szCs w:val="28"/>
           <w:rtl/>
         </w:rPr>
+        <w:t>Polling</w:t>
+      </w:r>
+      <w:proofErr w:type="spellEnd"/>
+      <w:r>
+        <w:rPr>
+          <w:rFonts w:ascii="David" w:hAnsi="David" w:cs="David"/>
+          <w:color w:val="111111"/>
+          <w:sz w:val="28"/>
+          <w:szCs w:val="28"/>
+          <w:rtl/>
+        </w:rPr>
+        <w:t xml:space="preserve"> המערכת מסירה כל </w:t>
+      </w:r>
+      <w:proofErr w:type="spellStart"/>
+      <w:r>
+        <w:rPr>
+          <w:rFonts w:ascii="David" w:hAnsi="David" w:cs="David"/>
+          <w:color w:val="111111"/>
+          <w:sz w:val="28"/>
+          <w:szCs w:val="28"/>
+          <w:rtl/>
+        </w:rPr>
         <w:t>Token</w:t>
       </w:r>
       <w:proofErr w:type="spellEnd"/>
@@ -10094,7 +9831,139 @@
           <w:szCs w:val="28"/>
           <w:rtl/>
         </w:rPr>
-        <w:t>]: אם לפני הפקודה התקבל רצף לא מוכר, המשפט השלם אינו תואם למיפוי המדויק, ולכן יש לחזור על הפקודה. הגבלת אוצר המילים משפרת יעילות, אך דורשת ניסוח ברור וזהה לפקודות שהוגדרו.</w:t>
+        <w:t>], גם כאשר הוא מופיע בתחילת הפקודה, בסופה או בין מילותיה; תוצאה שמכילה רק [</w:t>
+      </w:r>
+      <w:proofErr w:type="spellStart"/>
+      <w:r>
+        <w:rPr>
+          <w:rFonts w:ascii="David" w:hAnsi="David" w:cs="David"/>
+          <w:color w:val="111111"/>
+          <w:sz w:val="28"/>
+          <w:szCs w:val="28"/>
+          <w:rtl/>
+        </w:rPr>
+        <w:t>unk</w:t>
+      </w:r>
+      <w:proofErr w:type="spellEnd"/>
+      <w:r>
+        <w:rPr>
+          <w:rFonts w:ascii="David" w:hAnsi="David" w:cs="David"/>
+          <w:color w:val="111111"/>
+          <w:sz w:val="28"/>
+          <w:szCs w:val="28"/>
+          <w:rtl/>
+        </w:rPr>
+        <w:t xml:space="preserve">] נזרקת. כך, לדוגמה, </w:t>
+      </w:r>
+      <w:proofErr w:type="spellStart"/>
+      <w:r>
+        <w:rPr>
+          <w:rFonts w:ascii="David" w:hAnsi="David" w:cs="David"/>
+          <w:color w:val="111111"/>
+          <w:sz w:val="28"/>
+          <w:szCs w:val="28"/>
+          <w:rtl/>
+        </w:rPr>
+        <w:t>take</w:t>
+      </w:r>
+      <w:proofErr w:type="spellEnd"/>
+      <w:r>
+        <w:rPr>
+          <w:rFonts w:ascii="David" w:hAnsi="David" w:cs="David"/>
+          <w:color w:val="111111"/>
+          <w:sz w:val="28"/>
+          <w:szCs w:val="28"/>
+          <w:rtl/>
+        </w:rPr>
+        <w:t xml:space="preserve"> [</w:t>
+      </w:r>
+      <w:proofErr w:type="spellStart"/>
+      <w:r>
+        <w:rPr>
+          <w:rFonts w:ascii="David" w:hAnsi="David" w:cs="David"/>
+          <w:color w:val="111111"/>
+          <w:sz w:val="28"/>
+          <w:szCs w:val="28"/>
+          <w:rtl/>
+        </w:rPr>
+        <w:t>unk</w:t>
+      </w:r>
+      <w:proofErr w:type="spellEnd"/>
+      <w:r>
+        <w:rPr>
+          <w:rFonts w:ascii="David" w:hAnsi="David" w:cs="David"/>
+          <w:color w:val="111111"/>
+          <w:sz w:val="28"/>
+          <w:szCs w:val="28"/>
+          <w:rtl/>
+        </w:rPr>
+        <w:t xml:space="preserve">] </w:t>
+      </w:r>
+      <w:proofErr w:type="spellStart"/>
+      <w:r>
+        <w:rPr>
+          <w:rFonts w:ascii="David" w:hAnsi="David" w:cs="David"/>
+          <w:color w:val="111111"/>
+          <w:sz w:val="28"/>
+          <w:szCs w:val="28"/>
+          <w:rtl/>
+        </w:rPr>
+        <w:t>off</w:t>
+      </w:r>
+      <w:proofErr w:type="spellEnd"/>
+      <w:r>
+        <w:rPr>
+          <w:rFonts w:ascii="David" w:hAnsi="David" w:cs="David"/>
+          <w:color w:val="111111"/>
+          <w:sz w:val="28"/>
+          <w:szCs w:val="28"/>
+          <w:rtl/>
+        </w:rPr>
+        <w:t xml:space="preserve"> מנורמל ל-</w:t>
+      </w:r>
+      <w:proofErr w:type="spellStart"/>
+      <w:r>
+        <w:rPr>
+          <w:rFonts w:ascii="David" w:hAnsi="David" w:cs="David"/>
+          <w:color w:val="111111"/>
+          <w:sz w:val="28"/>
+          <w:szCs w:val="28"/>
+          <w:rtl/>
+        </w:rPr>
+        <w:t>take</w:t>
+      </w:r>
+      <w:proofErr w:type="spellEnd"/>
+      <w:r>
+        <w:rPr>
+          <w:rFonts w:ascii="David" w:hAnsi="David" w:cs="David"/>
+          <w:color w:val="111111"/>
+          <w:sz w:val="28"/>
+          <w:szCs w:val="28"/>
+          <w:rtl/>
+        </w:rPr>
+        <w:t xml:space="preserve"> </w:t>
+      </w:r>
+      <w:proofErr w:type="spellStart"/>
+      <w:r>
+        <w:rPr>
+          <w:rFonts w:ascii="David" w:hAnsi="David" w:cs="David"/>
+          <w:color w:val="111111"/>
+          <w:sz w:val="28"/>
+          <w:szCs w:val="28"/>
+          <w:rtl/>
+        </w:rPr>
+        <w:t>off</w:t>
+      </w:r>
+      <w:proofErr w:type="spellEnd"/>
+      <w:r>
+        <w:rPr>
+          <w:rFonts w:ascii="David" w:hAnsi="David" w:cs="David"/>
+          <w:color w:val="111111"/>
+          <w:sz w:val="28"/>
+          <w:szCs w:val="28"/>
+          <w:rtl/>
+        </w:rPr>
+        <w:t xml:space="preserve"> לפני המיפוי לפקודת הטיסה.</w:t>
       </w:r>
     </w:p>
     <w:p>
@@ -10384,6 +10253,73 @@
           <w:rtl/>
         </w:rPr>
         <w:t>, עצירת RC בעת אובדן יעד ונחיתה בטוחה צמצמו סיכון ואפשרו פיתוח הדרגתי.</w:t>
+      </w:r>
+    </w:p>
+    <w:p>
+      <w:pPr>
+        <w:bidi/>
+        <w:spacing w:line="360" w:lineRule="auto"/>
+        <w:rPr>
+          <w:rFonts w:ascii="David" w:hAnsi="David" w:cs="David"/>
+          <w:color w:val="111111"/>
+          <w:sz w:val="28"/>
+          <w:szCs w:val="28"/>
+          <w:rtl/>
+        </w:rPr>
+      </w:pPr>
+      <w:r>
+        <w:rPr>
+          <w:rFonts w:ascii="David" w:hAnsi="David" w:cs="David"/>
+          <w:color w:val="111111"/>
+          <w:sz w:val="28"/>
+          <w:szCs w:val="28"/>
+          <w:rtl/>
+        </w:rPr>
+        <w:t xml:space="preserve">בעיה נוספת התגלתה במהלך ניסויי החומרה: </w:t>
+      </w:r>
+      <w:proofErr w:type="spellStart"/>
+      <w:r>
+        <w:rPr>
+          <w:rFonts w:ascii="David" w:hAnsi="David" w:cs="David"/>
+          <w:color w:val="111111"/>
+          <w:sz w:val="28"/>
+          <w:szCs w:val="28"/>
+          <w:rtl/>
+        </w:rPr>
+        <w:t>הרחפן</w:t>
+      </w:r>
+      <w:proofErr w:type="spellEnd"/>
+      <w:r>
+        <w:rPr>
+          <w:rFonts w:ascii="David" w:hAnsi="David" w:cs="David"/>
+          <w:color w:val="111111"/>
+          <w:sz w:val="28"/>
+          <w:szCs w:val="28"/>
+          <w:rtl/>
+        </w:rPr>
+        <w:t xml:space="preserve"> זלג הצידה גם כאשר לא נשלחה אליו שום פקודת תנועה. לאחר בדיקה וחקר הבנו שמערכת הייצוב התחתונה מתקשה להעריך את מיקום </w:t>
+      </w:r>
+      <w:proofErr w:type="spellStart"/>
+      <w:r>
+        <w:rPr>
+          <w:rFonts w:ascii="David" w:hAnsi="David" w:cs="David"/>
+          <w:color w:val="111111"/>
+          <w:sz w:val="28"/>
+          <w:szCs w:val="28"/>
+          <w:rtl/>
+        </w:rPr>
+        <w:t>הרחפן</w:t>
+      </w:r>
+      <w:proofErr w:type="spellEnd"/>
+      <w:r>
+        <w:rPr>
+          <w:rFonts w:ascii="David" w:hAnsi="David" w:cs="David"/>
+          <w:color w:val="111111"/>
+          <w:sz w:val="28"/>
+          <w:szCs w:val="28"/>
+          <w:rtl/>
+        </w:rPr>
+        <w:t xml:space="preserve"> מול הרצפה שעליה נערכו הניסויים, משום שהמצלמה התחתונה וחיישני האינפרה-אדום לא קיבלו ממנה מידע חזותי אמין מספיק. כדי לפתור את הבעיה נאלצנו לפרוס שמיכה בעלת מרקם מתחת לרחפן; הפרטים והניגודיות שעל השמיכה אפשרו לו לייצב את עצמו ולצמצם את הזליגה הצידית.</w:t>
       </w:r>
     </w:p>
     <w:p>
@@ -10901,6 +10837,7 @@
           <w:szCs w:val="28"/>
           <w:rtl/>
         </w:rPr>
+        <w:lastRenderedPageBreak/>
         <w:t>6.3 עבודה עתידית</w:t>
       </w:r>
       <w:bookmarkEnd w:id="16"/>
@@ -11027,7 +10964,7 @@
           <w:szCs w:val="28"/>
           <w:rtl/>
         </w:rPr>
-        <w:t>מעבר מלא בין מצבים באמצעות קול והקשחת הטיפול ב-[</w:t>
+        <w:t>שיפור זיהוי פקודות חלקיות ורועשות והרחבת אוצר המילים הקולי מעבר לניקוי [</w:t>
       </w:r>
       <w:proofErr w:type="spellStart"/>
       <w:r>
@@ -11049,7 +10986,7 @@
           <w:szCs w:val="28"/>
           <w:rtl/>
         </w:rPr>
-        <w:t>] ובמשפטים חלקיים.</w:t>
+        <w:t>] הקיים.</w:t>
       </w:r>
     </w:p>
     <w:p>
@@ -11127,7 +11064,6 @@
         <w:rPr>
           <w:rtl/>
         </w:rPr>
-        <w:lastRenderedPageBreak/>
         <w:t>7. תוצרים ומקורות</w:t>
       </w:r>
       <w:bookmarkEnd w:id="17"/>
@@ -11215,9 +11151,10 @@
         <w:bidi/>
         <w:spacing w:after="60" w:line="360" w:lineRule="auto"/>
         <w:rPr>
-          <w:rFonts w:ascii="David" w:hAnsi="David" w:cs="David"/>
-          <w:sz w:val="28"/>
-          <w:szCs w:val="28"/>
+          <w:rFonts w:ascii="David" w:hAnsi="David" w:cs="David" w:hint="cs"/>
+          <w:sz w:val="28"/>
+          <w:szCs w:val="28"/>
+          <w:rtl/>
         </w:rPr>
       </w:pPr>
       <w:r>
@@ -11229,29 +11166,54 @@
           <w:szCs w:val="28"/>
           <w:rtl/>
         </w:rPr>
-        <w:t xml:space="preserve">סרטון הדגמה: </w:t>
-      </w:r>
+        <w:t>סרטון הדגמה</w:t>
+      </w:r>
+      <w:r>
+        <w:rPr>
+          <w:rFonts w:ascii="David" w:hAnsi="David" w:cs="David"/>
+          <w:b/>
+          <w:color w:val="111111"/>
+          <w:sz w:val="28"/>
+          <w:szCs w:val="28"/>
+        </w:rPr>
+        <w:t xml:space="preserve"> </w:t>
+      </w:r>
+      <w:proofErr w:type="spellStart"/>
       <w:r>
         <w:rPr>
           <w:rFonts w:ascii="David" w:hAnsi="David" w:cs="David" w:hint="cs"/>
-          <w:color w:val="111111"/>
-          <w:sz w:val="28"/>
-          <w:szCs w:val="28"/>
-          <w:rtl/>
-        </w:rPr>
-        <w:t>ב</w:t>
-      </w:r>
-      <w:proofErr w:type="spellStart"/>
-      <w:r>
-        <w:rPr>
-          <w:rFonts w:ascii="David" w:hAnsi="David" w:cs="David"/>
-          <w:color w:val="111111"/>
-          <w:sz w:val="28"/>
-          <w:szCs w:val="28"/>
-        </w:rPr>
-        <w:t>github</w:t>
+          <w:b/>
+          <w:color w:val="111111"/>
+          <w:sz w:val="28"/>
+          <w:szCs w:val="28"/>
+          <w:rtl/>
+        </w:rPr>
+        <w:t>ביוטיוב</w:t>
       </w:r>
       <w:proofErr w:type="spellEnd"/>
+      <w:r>
+        <w:rPr>
+          <w:rFonts w:ascii="David" w:hAnsi="David" w:cs="David" w:hint="cs"/>
+          <w:b/>
+          <w:color w:val="111111"/>
+          <w:sz w:val="28"/>
+          <w:szCs w:val="28"/>
+          <w:rtl/>
+        </w:rPr>
+        <w:t xml:space="preserve"> :</w:t>
+      </w:r>
+      <w:hyperlink r:id="rId9" w:history="1">
+        <w:r>
+          <w:rPr>
+            <w:rStyle w:val="Hyperlink"/>
+            <w:rFonts w:ascii="David" w:hAnsi="David" w:cs="David"/>
+            <w:bCs/>
+            <w:sz w:val="28"/>
+            <w:szCs w:val="28"/>
+          </w:rPr>
+          <w:t>https://youtu.be/iAPDhFUHGZo</w:t>
+        </w:r>
+      </w:hyperlink>
     </w:p>
     <w:p>
       <w:pPr>
@@ -11274,7 +11236,7 @@
         </w:rPr>
         <w:t xml:space="preserve">1. </w:t>
       </w:r>
-      <w:hyperlink r:id="rId9">
+      <w:hyperlink r:id="rId10">
         <w:proofErr w:type="spellStart"/>
         <w:r>
           <w:rPr>
@@ -11320,7 +11282,7 @@
         </w:rPr>
         <w:t xml:space="preserve">2. </w:t>
       </w:r>
-      <w:hyperlink r:id="rId10">
+      <w:hyperlink r:id="rId11">
         <w:proofErr w:type="spellStart"/>
         <w:r>
           <w:rPr>
@@ -11366,7 +11328,7 @@
         </w:rPr>
         <w:t xml:space="preserve">3. </w:t>
       </w:r>
-      <w:hyperlink r:id="rId11">
+      <w:hyperlink r:id="rId12">
         <w:proofErr w:type="spellStart"/>
         <w:r>
           <w:rPr>
@@ -11412,7 +11374,7 @@
         </w:rPr>
         <w:t xml:space="preserve">4. </w:t>
       </w:r>
-      <w:hyperlink r:id="rId12">
+      <w:hyperlink r:id="rId13">
         <w:r>
           <w:rPr>
             <w:rFonts w:ascii="David" w:hAnsi="David" w:cs="David"/>
@@ -11446,7 +11408,7 @@
         </w:rPr>
         <w:t xml:space="preserve">5. </w:t>
       </w:r>
-      <w:hyperlink r:id="rId13">
+      <w:hyperlink r:id="rId14">
         <w:proofErr w:type="spellStart"/>
         <w:r>
           <w:rPr>
@@ -11492,7 +11454,7 @@
         </w:rPr>
         <w:t xml:space="preserve">6. </w:t>
       </w:r>
-      <w:hyperlink r:id="rId14">
+      <w:hyperlink r:id="rId15">
         <w:r>
           <w:rPr>
             <w:rFonts w:ascii="David" w:hAnsi="David" w:cs="David"/>
@@ -11506,7 +11468,7 @@
       </w:hyperlink>
     </w:p>
     <w:sectPr>
-      <w:footerReference w:type="default" r:id="rId15"/>
+      <w:footerReference w:type="default" r:id="rId16"/>
       <w:pgSz w:w="12240" w:h="15840"/>
       <w:pgMar w:top="893" w:right="1037" w:bottom="893" w:left="1037" w:header="360" w:footer="432" w:gutter="0"/>
       <w:cols w:space="720"/>
@@ -12518,6 +12480,7 @@
   <w:style w:type="character" w:default="1" w:styleId="DefaultParagraphFont">
     <w:name w:val="Default Paragraph Font"/>
     <w:uiPriority w:val="1"/>
+    <w:semiHidden/>
     <w:unhideWhenUsed/>
   </w:style>
   <w:style w:type="table" w:default="1" w:styleId="TableNormal">
@@ -23331,6 +23294,18 @@
       <w:u w:val="single"/>
     </w:rPr>
   </w:style>
+  <w:style w:type="character" w:styleId="UnresolvedMention">
+    <w:name w:val="Unresolved Mention"/>
+    <w:basedOn w:val="DefaultParagraphFont"/>
+    <w:uiPriority w:val="99"/>
+    <w:semiHidden/>
+    <w:unhideWhenUsed/>
+    <w:rsid w:val="006F5D60"/>
+    <w:rPr>
+      <w:color w:val="605E5C"/>
+      <w:shd w:val="clear" w:color="auto" w:fill="E1DFDD"/>
+    </w:rPr>
+  </w:style>
 </w:styles>
 </file>
 

</xml_diff>